<commit_message>
Move result analysis below figures
</commit_message>
<xml_diff>
--- a/实验3-数字图像处理实验指导书-作答版-代码截图.docx
+++ b/实验3-数字图像处理实验指导书-作答版-代码截图.docx
@@ -539,29 +539,7 @@
           <w:b/>
           <w:sz w:val="21"/>
         </w:rPr>
-        <w:t>1.噪声生成 实验结果与分析：</w:t>
-      </w:r>
-    </w:p>
-    <w:p>
-      <w:pPr/>
-      <w:r>
-        <w:rPr>
-          <w:rFonts w:ascii="Times New Roman" w:hAnsi="Times New Roman" w:eastAsia="Times New Roman"/>
-          <w:b w:val="0"/>
-          <w:sz w:val="21"/>
-        </w:rPr>
-        <w:t>高斯噪声表现为整幅图像灰度的随机扰动，方差从0.2增大到0.8时，图像颗粒感增强，局部细节和对比关系被随机波动淹没得更明显。</w:t>
-      </w:r>
-    </w:p>
-    <w:p>
-      <w:pPr/>
-      <w:r>
-        <w:rPr>
-          <w:rFonts w:ascii="Times New Roman" w:hAnsi="Times New Roman" w:eastAsia="Times New Roman"/>
-          <w:b w:val="0"/>
-          <w:sz w:val="21"/>
-        </w:rPr>
-        <w:t>椒盐噪声表现为随机黑白脉冲点，概率从0.2增大到0.8时，黑白噪声点密度快速增加，图像结构被大量极值像素破坏，主观可辨性明显下降。</w:t>
+        <w:t>1.噪声生成 实验结果：</w:t>
       </w:r>
     </w:p>
     <w:p>
@@ -665,6 +643,39 @@
       <w:r>
         <w:rPr>
           <w:rFonts w:ascii="Times New Roman" w:hAnsi="Times New Roman" w:eastAsia="Times New Roman"/>
+          <w:b/>
+          <w:sz w:val="21"/>
+        </w:rPr>
+        <w:t>1.噪声生成 结果分析：</w:t>
+      </w:r>
+    </w:p>
+    <w:p>
+      <w:pPr/>
+      <w:r>
+        <w:rPr>
+          <w:rFonts w:ascii="Times New Roman" w:hAnsi="Times New Roman" w:eastAsia="Times New Roman"/>
+          <w:b w:val="0"/>
+          <w:sz w:val="21"/>
+        </w:rPr>
+        <w:t>高斯噪声表现为整幅图像灰度的随机扰动，方差从0.2增大到0.8时，图像颗粒感增强，局部细节和对比关系被随机波动淹没得更明显。</w:t>
+      </w:r>
+    </w:p>
+    <w:p>
+      <w:pPr/>
+      <w:r>
+        <w:rPr>
+          <w:rFonts w:ascii="Times New Roman" w:hAnsi="Times New Roman" w:eastAsia="Times New Roman"/>
+          <w:b w:val="0"/>
+          <w:sz w:val="21"/>
+        </w:rPr>
+        <w:t>椒盐噪声表现为随机黑白脉冲点，概率从0.2增大到0.8时，黑白噪声点密度快速增加，图像结构被大量极值像素破坏，主观可辨性明显下降。</w:t>
+      </w:r>
+    </w:p>
+    <w:p>
+      <w:pPr/>
+      <w:r>
+        <w:rPr>
+          <w:rFonts w:ascii="Times New Roman" w:hAnsi="Times New Roman" w:eastAsia="Times New Roman"/>
           <w:b w:val="0"/>
           <w:sz w:val="21"/>
         </w:rPr>
@@ -1121,29 +1132,7 @@
           <w:b/>
           <w:sz w:val="21"/>
         </w:rPr>
-        <w:t>2.空间滤波去除噪声 实验结果与分析：</w:t>
-      </w:r>
-    </w:p>
-    <w:p>
-      <w:pPr/>
-      <w:r>
-        <w:rPr>
-          <w:rFonts w:ascii="Times New Roman" w:hAnsi="Times New Roman" w:eastAsia="Times New Roman"/>
-          <w:b w:val="0"/>
-          <w:sz w:val="21"/>
-        </w:rPr>
-        <w:t>对椒盐噪声使用相同3x3模板时，噪声概率越大，残留噪声越多，图像细节越难恢复；对概率0.5的椒盐噪声，模板由3x3增大到9x9时，噪声点明显减少，但边缘和细节也逐渐模糊。</w:t>
-      </w:r>
-    </w:p>
-    <w:p>
-      <w:pPr/>
-      <w:r>
-        <w:rPr>
-          <w:rFonts w:ascii="Times New Roman" w:hAnsi="Times New Roman" w:eastAsia="Times New Roman"/>
-          <w:b w:val="0"/>
-          <w:sz w:val="21"/>
-        </w:rPr>
-        <w:t>对高斯噪声，均值滤波能够通过邻域平均降低随机波动，中值滤波也有一定平滑效果但不如均值滤波自然；对椒盐噪声，中值滤波明显优于均值滤波，因为中值运算能抑制极端黑白噪声点，而均值滤波会把脉冲噪声扩散成灰斑。</w:t>
+        <w:t>2.空间滤波去除噪声 实验结果：</w:t>
       </w:r>
     </w:p>
     <w:p>
@@ -1295,6 +1284,39 @@
       <w:r>
         <w:rPr>
           <w:rFonts w:ascii="Times New Roman" w:hAnsi="Times New Roman" w:eastAsia="Times New Roman"/>
+          <w:b/>
+          <w:sz w:val="21"/>
+        </w:rPr>
+        <w:t>2.空间滤波去除噪声 结果分析：</w:t>
+      </w:r>
+    </w:p>
+    <w:p>
+      <w:pPr/>
+      <w:r>
+        <w:rPr>
+          <w:rFonts w:ascii="Times New Roman" w:hAnsi="Times New Roman" w:eastAsia="Times New Roman"/>
+          <w:b w:val="0"/>
+          <w:sz w:val="21"/>
+        </w:rPr>
+        <w:t>对椒盐噪声使用相同3x3模板时，噪声概率越大，残留噪声越多，图像细节越难恢复；对概率0.5的椒盐噪声，模板由3x3增大到9x9时，噪声点明显减少，但边缘和细节也逐渐模糊。</w:t>
+      </w:r>
+    </w:p>
+    <w:p>
+      <w:pPr/>
+      <w:r>
+        <w:rPr>
+          <w:rFonts w:ascii="Times New Roman" w:hAnsi="Times New Roman" w:eastAsia="Times New Roman"/>
+          <w:b w:val="0"/>
+          <w:sz w:val="21"/>
+        </w:rPr>
+        <w:t>对高斯噪声，均值滤波能够通过邻域平均降低随机波动，中值滤波也有一定平滑效果但不如均值滤波自然；对椒盐噪声，中值滤波明显优于均值滤波，因为中值运算能抑制极端黑白噪声点，而均值滤波会把脉冲噪声扩散成灰斑。</w:t>
+      </w:r>
+    </w:p>
+    <w:p>
+      <w:pPr/>
+      <w:r>
+        <w:rPr>
+          <w:rFonts w:ascii="Times New Roman" w:hAnsi="Times New Roman" w:eastAsia="Times New Roman"/>
           <w:b w:val="0"/>
           <w:sz w:val="21"/>
         </w:rPr>
@@ -1575,18 +1597,7 @@
           <w:b/>
           <w:sz w:val="21"/>
         </w:rPr>
-        <w:t>3.图像的锐化滤波 实验结果与分析：</w:t>
-      </w:r>
-    </w:p>
-    <w:p>
-      <w:pPr/>
-      <w:r>
-        <w:rPr>
-          <w:rFonts w:ascii="Times New Roman" w:hAnsi="Times New Roman" w:eastAsia="Times New Roman"/>
-          <w:b w:val="0"/>
-          <w:sz w:val="21"/>
-        </w:rPr>
-        <w:t>Laplacian滤波属于二阶微分锐化处理，能够突出建筑边缘、线条和灰度突变区域，使轮廓更加清晰；均值滤波属于平滑处理，能够抑制局部灰度起伏，但会使边缘和纹理变模糊。</w:t>
+        <w:t>3.图像的锐化滤波 实验结果：</w:t>
       </w:r>
     </w:p>
     <w:p>
@@ -1642,6 +1653,28 @@
       <w:r>
         <w:rPr>
           <w:rFonts w:ascii="Times New Roman" w:hAnsi="Times New Roman" w:eastAsia="Times New Roman"/>
+          <w:b/>
+          <w:sz w:val="21"/>
+        </w:rPr>
+        <w:t>3.图像的锐化滤波 结果分析：</w:t>
+      </w:r>
+    </w:p>
+    <w:p>
+      <w:pPr/>
+      <w:r>
+        <w:rPr>
+          <w:rFonts w:ascii="Times New Roman" w:hAnsi="Times New Roman" w:eastAsia="Times New Roman"/>
+          <w:b w:val="0"/>
+          <w:sz w:val="21"/>
+        </w:rPr>
+        <w:t>Laplacian滤波属于二阶微分锐化处理，能够突出建筑边缘、线条和灰度突变区域，使轮廓更加清晰；均值滤波属于平滑处理，能够抑制局部灰度起伏，但会使边缘和纹理变模糊。</w:t>
+      </w:r>
+    </w:p>
+    <w:p>
+      <w:pPr/>
+      <w:r>
+        <w:rPr>
+          <w:rFonts w:ascii="Times New Roman" w:hAnsi="Times New Roman" w:eastAsia="Times New Roman"/>
           <w:b w:val="0"/>
           <w:sz w:val="21"/>
         </w:rPr>
@@ -1790,29 +1823,7 @@
           <w:b/>
           <w:sz w:val="21"/>
         </w:rPr>
-        <w:t>4.滤波器去噪效果 实验结果与分析：</w:t>
-      </w:r>
-    </w:p>
-    <w:p>
-      <w:pPr/>
-      <w:r>
-        <w:rPr>
-          <w:rFonts w:ascii="Times New Roman" w:hAnsi="Times New Roman" w:eastAsia="Times New Roman"/>
-          <w:b w:val="0"/>
-          <w:sz w:val="21"/>
-        </w:rPr>
-        <w:t>实验采用 electric.tif，分别加入方差为0.2的高斯噪声和概率为0.2的椒盐噪声，然后使用自编均值滤波器与自编中值滤波器进行3x3、5x5、9x9模板处理。</w:t>
-      </w:r>
-    </w:p>
-    <w:p>
-      <w:pPr/>
-      <w:r>
-        <w:rPr>
-          <w:rFonts w:ascii="Times New Roman" w:hAnsi="Times New Roman" w:eastAsia="Times New Roman"/>
-          <w:b w:val="0"/>
-          <w:sz w:val="21"/>
-        </w:rPr>
-        <w:t>定性结果表明：均值滤波对高斯噪声有较明显的平滑作用，但会削弱边缘和细节；中值滤波对椒盐噪声效果更好，能够有效去除黑白脉冲点，同时较好保持边缘。模板越大，去噪越强，但图像越容易模糊，9x9模板细节损失最明显。</w:t>
+        <w:t>4.滤波器去噪效果 实验结果：</w:t>
       </w:r>
     </w:p>
     <w:p>
@@ -1909,6 +1920,39 @@
             </a:graphic>
           </wp:inline>
         </w:drawing>
+      </w:r>
+    </w:p>
+    <w:p>
+      <w:pPr/>
+      <w:r>
+        <w:rPr>
+          <w:rFonts w:ascii="Times New Roman" w:hAnsi="Times New Roman" w:eastAsia="Times New Roman"/>
+          <w:b/>
+          <w:sz w:val="21"/>
+        </w:rPr>
+        <w:t>4.滤波器去噪效果 结果分析：</w:t>
+      </w:r>
+    </w:p>
+    <w:p>
+      <w:pPr/>
+      <w:r>
+        <w:rPr>
+          <w:rFonts w:ascii="Times New Roman" w:hAnsi="Times New Roman" w:eastAsia="Times New Roman"/>
+          <w:b w:val="0"/>
+          <w:sz w:val="21"/>
+        </w:rPr>
+        <w:t>实验采用 electric.tif，分别加入方差为0.2的高斯噪声和概率为0.2的椒盐噪声，然后使用自编均值滤波器与自编中值滤波器进行3x3、5x5、9x9模板处理。</w:t>
+      </w:r>
+    </w:p>
+    <w:p>
+      <w:pPr/>
+      <w:r>
+        <w:rPr>
+          <w:rFonts w:ascii="Times New Roman" w:hAnsi="Times New Roman" w:eastAsia="Times New Roman"/>
+          <w:b w:val="0"/>
+          <w:sz w:val="21"/>
+        </w:rPr>
+        <w:t>定性结果表明：均值滤波对高斯噪声有较明显的平滑作用，但会削弱边缘和细节；中值滤波对椒盐噪声效果更好，能够有效去除黑白脉冲点，同时较好保持边缘。模板越大，去噪越强，但图像越容易模糊，9x9模板细节损失最明显。</w:t>
       </w:r>
     </w:p>
     <w:p>

</xml_diff>